<commit_message>
docs: update betting research skill creation notes
Co-Authored-By: Claude Sonnet 4.6 <noreply@anthropic.com>
</commit_message>
<xml_diff>
--- a/knowledge-base/raw/20260630 creating claude skill for betting research.docx
+++ b/knowledge-base/raw/20260630 creating claude skill for betting research.docx
@@ -58,7 +58,15 @@
     </w:p>
     <w:p>
       <w:r>
-        <w:t>│                 Welcome back Myles!                │ Run /init to create a CLAUDE.md file with instructions for Claude │</w:t>
+        <w:t>│                 Welcome back Myles!                │ Run /</w:t>
+      </w:r>
+      <w:proofErr w:type="spellStart"/>
+      <w:r>
+        <w:t>init</w:t>
+      </w:r>
+      <w:proofErr w:type="spellEnd"/>
+      <w:r>
+        <w:t xml:space="preserve"> to create a CLAUDE.md file with instructions for Claude │</w:t>
       </w:r>
     </w:p>
     <w:p>
@@ -194,7 +202,15 @@
         <w:t>✻</w:t>
       </w:r>
       <w:r>
-        <w:t xml:space="preserve"> Conversation compacted (ctrl+o for history)</w:t>
+        <w:t xml:space="preserve"> Conversation compacted (</w:t>
+      </w:r>
+      <w:proofErr w:type="spellStart"/>
+      <w:r>
+        <w:t>ctrl+o</w:t>
+      </w:r>
+      <w:proofErr w:type="spellEnd"/>
+      <w:r>
+        <w:t xml:space="preserve"> for history)</w:t>
       </w:r>
     </w:p>
     <w:p/>
@@ -507,12 +523,28 @@
         <w:t>❯</w:t>
       </w:r>
       <w:r>
-        <w:t xml:space="preserve"> i want a skill that will do the work for each section, in order (they build on each other). it will also write tests at the end  </w:t>
-      </w:r>
-    </w:p>
-    <w:p>
-      <w:r>
-        <w:t xml:space="preserve">  of each section before proceeding. does this make sense? it's essentially my betting research process boiled down into a claude  </w:t>
+        <w:t xml:space="preserve"> </w:t>
+      </w:r>
+      <w:proofErr w:type="spellStart"/>
+      <w:r>
+        <w:t>i</w:t>
+      </w:r>
+      <w:proofErr w:type="spellEnd"/>
+      <w:r>
+        <w:t xml:space="preserve"> want a skill that will do the work for each section, in order (they build on each other). it will also write tests at the end  </w:t>
+      </w:r>
+    </w:p>
+    <w:p>
+      <w:r>
+        <w:t xml:space="preserve">  of each section before proceeding. does this make sense? it's essentially my betting research process boiled down into a </w:t>
+      </w:r>
+      <w:proofErr w:type="spellStart"/>
+      <w:r>
+        <w:t>claude</w:t>
+      </w:r>
+      <w:proofErr w:type="spellEnd"/>
+      <w:r>
+        <w:t xml:space="preserve">  </w:t>
       </w:r>
     </w:p>
     <w:p>
@@ -607,31 +639,109 @@
     </w:p>
     <w:p>
       <w:r>
-        <w:t>-Get data / do light EDA (both the market itself ie. Market data, and features that could potentially predict the outcome ie. box score data, usually)</w:t>
+        <w:t xml:space="preserve">-Get data / do light EDA (both the market itself </w:t>
+      </w:r>
+      <w:proofErr w:type="spellStart"/>
+      <w:r>
+        <w:t>ie</w:t>
+      </w:r>
+      <w:proofErr w:type="spellEnd"/>
+      <w:r>
+        <w:t xml:space="preserve">. Market data, and features that could potentially predict the outcome </w:t>
+      </w:r>
+      <w:proofErr w:type="spellStart"/>
+      <w:r>
+        <w:t>ie</w:t>
+      </w:r>
+      <w:proofErr w:type="spellEnd"/>
+      <w:r>
+        <w:t>. box score data, usually)</w:t>
       </w:r>
     </w:p>
     <w:p>
       <w:r>
         <w:t>-Build feature set / spine of rolling features, typical Data Engineering for predictive modeling</w:t>
       </w:r>
-    </w:p>
-    <w:p>
-      <w:r>
-        <w:t>-Train model + score on accuracy metrics only (ie., no ROI/units won, just accuracy/AUC/precision/recall/RMSE/MAE etc. (step 1: using regression/easily interpretable models on target with each n=1 individual ptedictor, step 2, doing same with XGBoost, step 3, beginning to do both regressions/XGBoost with combos of good individual predictors) [I’ve found this to work much better than kitchen sink of keeping all feature vars]</w:t>
-      </w:r>
-    </w:p>
-    <w:p>
-      <w:r>
-        <w:t>-Use model to generate distribution of outcomes (ie. Turn predicted line/outcome into a binary that can be related to a bet, which is binary</w:t>
+      <w:r>
+        <w:t xml:space="preserve"> (IMPORTANT NOTE: TRY 5-10 DIFF ROLLING WINDOWS, THEY SHOULD MAKE SENSE BASED ON SPORT BUT START WITH ROLLING 1, END WITH ROLLING CAREER, HAVE VALUES IN THE MIDDLE BC WE WANT TO FIND THE ONE WITH MOST PREDICTIVE POWER)</w:t>
+      </w:r>
+    </w:p>
+    <w:p>
+      <w:r>
+        <w:t>-Train model + score on accuracy metrics only (</w:t>
+      </w:r>
+      <w:proofErr w:type="spellStart"/>
+      <w:r>
+        <w:t>ie</w:t>
+      </w:r>
+      <w:proofErr w:type="spellEnd"/>
+      <w:r>
+        <w:t xml:space="preserve">., no ROI/units won, just accuracy/AUC/precision/recall/RMSE/MAE etc. (step 1: using regression/easily interpretable models on target with each n=1 individual </w:t>
+      </w:r>
+      <w:proofErr w:type="spellStart"/>
+      <w:r>
+        <w:t>ptedictor</w:t>
+      </w:r>
+      <w:proofErr w:type="spellEnd"/>
+      <w:r>
+        <w:t xml:space="preserve">, step 2, doing same with </w:t>
+      </w:r>
+      <w:proofErr w:type="spellStart"/>
+      <w:r>
+        <w:t>XGBoost</w:t>
+      </w:r>
+      <w:proofErr w:type="spellEnd"/>
+      <w:r>
+        <w:t>, step 3, beginning to do both regressions/</w:t>
+      </w:r>
+      <w:proofErr w:type="spellStart"/>
+      <w:r>
+        <w:t>XGBoost</w:t>
+      </w:r>
+      <w:proofErr w:type="spellEnd"/>
+      <w:r>
+        <w:t xml:space="preserve"> with combos of good individual predictors) [I’ve found this to work much better than kitchen sink of keeping all feature vars]</w:t>
+      </w:r>
+    </w:p>
+    <w:p>
+      <w:r>
+        <w:t>-Use model to generate distribution of outcomes (</w:t>
+      </w:r>
+      <w:proofErr w:type="spellStart"/>
+      <w:r>
+        <w:t>ie</w:t>
+      </w:r>
+      <w:proofErr w:type="spellEnd"/>
+      <w:r>
+        <w:t>. Turn predicted line/outcome into a binary that can be related to a bet, which is binary</w:t>
       </w:r>
       <w:r>
         <w:br/>
-        <w:t>-Out of sample evaluation of proposed strategies using a grid search (threshold of edge ie. 0.01 vs. 0.05 vs. 0.10, bet direction ie. Over/under/both, are 2 that are common. Sometimes others make sense too)</w:t>
-      </w:r>
-    </w:p>
-    <w:p>
+        <w:t xml:space="preserve">-Out of sample evaluation of proposed strategies using a grid search (threshold of edge </w:t>
+      </w:r>
+      <w:proofErr w:type="spellStart"/>
+      <w:r>
+        <w:t>ie</w:t>
+      </w:r>
+      <w:proofErr w:type="spellEnd"/>
+      <w:r>
+        <w:t xml:space="preserve">. </w:t>
+      </w:r>
       <w:r>
         <w:lastRenderedPageBreak/>
+        <w:t xml:space="preserve">0.01 vs. 0.05 vs. 0.10, bet direction </w:t>
+      </w:r>
+      <w:proofErr w:type="spellStart"/>
+      <w:r>
+        <w:t>ie</w:t>
+      </w:r>
+      <w:proofErr w:type="spellEnd"/>
+      <w:r>
+        <w:t>. Over/under/both, are 2 that are common. Sometimes others make sense too)</w:t>
+      </w:r>
+    </w:p>
+    <w:p>
+      <w:r>
         <w:t>-In sample evaluation. Ie. Do the last step but use the model trained on entire time span on the same data itself (Not best practice for ML problems, but give a good idea of what the model could exploit going forward, if conditions hold)</w:t>
       </w:r>
     </w:p>
@@ -650,7 +760,7 @@
       <w:r>
         <w:t xml:space="preserve"> -&gt; find today’s games -&gt; run today’s relevant games/players thru model so you can compare market outlook with ours and see if there is an edge -&gt; send email to </w:t>
       </w:r>
-      <w:hyperlink r:id="rId4" w:history="1">
+      <w:hyperlink r:id="rId5" w:history="1">
         <w:r>
           <w:rPr>
             <w:rStyle w:val="Hyperlink"/>
@@ -677,7 +787,23 @@
         <w:t xml:space="preserve">IMPORTANT NOTE: </w:t>
       </w:r>
       <w:r>
-        <w:t>/Users/thomasmyles/dev/betting/knowledge-base/raw/20260620 modeling nfl player sacks.docx</w:t>
+        <w:t>/Users/</w:t>
+      </w:r>
+      <w:proofErr w:type="spellStart"/>
+      <w:r>
+        <w:t>thomasmyles</w:t>
+      </w:r>
+      <w:proofErr w:type="spellEnd"/>
+      <w:r>
+        <w:t xml:space="preserve">/dev/betting/knowledge-base/raw/20260620 modeling </w:t>
+      </w:r>
+      <w:proofErr w:type="spellStart"/>
+      <w:r>
+        <w:t>nfl</w:t>
+      </w:r>
+      <w:proofErr w:type="spellEnd"/>
+      <w:r>
+        <w:t xml:space="preserve"> player sacks.docx</w:t>
       </w:r>
       <w:r>
         <w:t xml:space="preserve"> is a great example of how there is a linear process to this, but often bugs / other things are found along the way that causes you to have to “start over” and re-do a lot of the work. The point of this skill to reduce this and allow an agent to have a clear path when iterating.</w:t>
@@ -690,7 +816,23 @@
     </w:p>
     <w:p>
       <w:r>
-        <w:t>3-you will write the tests in SQL and while I run them in Cursor via command+return, you can call from terminal via duckdb yourself</w:t>
+        <w:t xml:space="preserve">3-you will write the tests in SQL and while I run them in Cursor via </w:t>
+      </w:r>
+      <w:proofErr w:type="spellStart"/>
+      <w:r>
+        <w:t>command+return</w:t>
+      </w:r>
+      <w:proofErr w:type="spellEnd"/>
+      <w:r>
+        <w:t xml:space="preserve">, you can call from terminal via </w:t>
+      </w:r>
+      <w:proofErr w:type="spellStart"/>
+      <w:r>
+        <w:t>duckdb</w:t>
+      </w:r>
+      <w:proofErr w:type="spellEnd"/>
+      <w:r>
+        <w:t xml:space="preserve"> yourself</w:t>
       </w:r>
     </w:p>
     <w:bookmarkEnd w:id="0"/>
@@ -709,7 +851,15 @@
         <w:t>⏺</w:t>
       </w:r>
       <w:r>
-        <w:t xml:space="preserve"> Got it. Seven predefined steps, DuckDB SQL tests after each, run from terminal, don't proceed until they pass. The sacks doc is</w:t>
+        <w:t xml:space="preserve"> Got it. Seven predefined steps, </w:t>
+      </w:r>
+      <w:proofErr w:type="spellStart"/>
+      <w:r>
+        <w:t>DuckDB</w:t>
+      </w:r>
+      <w:proofErr w:type="spellEnd"/>
+      <w:r>
+        <w:t xml:space="preserve"> SQL tests after each, run from terminal, don't proceed until they pass. The sacks doc is</w:t>
       </w:r>
     </w:p>
     <w:p>
@@ -724,140 +874,506 @@
     </w:p>
     <w:p>
       <w:r>
-        <w:t xml:space="preserve">  Let me check the project's .claude directory structure before writing the skill file.                                            </w:t>
-      </w:r>
-    </w:p>
-    <w:p>
-      <w:r>
+        <w:t xml:space="preserve">  Let me check the project's .</w:t>
+      </w:r>
+      <w:proofErr w:type="spellStart"/>
+      <w:r>
+        <w:t>claude</w:t>
+      </w:r>
+      <w:proofErr w:type="spellEnd"/>
+      <w:r>
+        <w:t xml:space="preserve"> directory structure before writing the skill file.                                            </w:t>
+      </w:r>
+    </w:p>
+    <w:p>
+      <w:r>
+        <w:lastRenderedPageBreak/>
         <w:t xml:space="preserve">                                                                                                                                   </w:t>
       </w:r>
     </w:p>
     <w:p>
       <w:r>
+        <w:t xml:space="preserve">  Listed 2 directories (</w:t>
+      </w:r>
+      <w:proofErr w:type="spellStart"/>
+      <w:r>
+        <w:t>ctrl+o</w:t>
+      </w:r>
+      <w:proofErr w:type="spellEnd"/>
+      <w:r>
+        <w:t xml:space="preserve"> to expand)                                                                                          </w:t>
+      </w:r>
+    </w:p>
+    <w:p>
+      <w:r>
+        <w:t xml:space="preserve">                                                                                                                                   </w:t>
+      </w:r>
+    </w:p>
+    <w:p>
+      <w:r>
+        <w:rPr>
+          <w:rFonts w:ascii="Apple Color Emoji" w:hAnsi="Apple Color Emoji" w:cs="Apple Color Emoji"/>
+        </w:rPr>
+        <w:t>⏺</w:t>
+      </w:r>
+      <w:r>
+        <w:t xml:space="preserve"> The project uses .</w:t>
+      </w:r>
+      <w:proofErr w:type="spellStart"/>
+      <w:r>
+        <w:t>claude</w:t>
+      </w:r>
+      <w:proofErr w:type="spellEnd"/>
+      <w:r>
+        <w:t xml:space="preserve">/commands/ (not skills/). Let me check an existing one to match the format.                 </w:t>
+      </w:r>
+    </w:p>
+    <w:p/>
+    <w:p>
+      <w:r>
+        <w:t>…</w:t>
+      </w:r>
+    </w:p>
+    <w:p>
+      <w:r>
+        <w:rPr>
+          <w:rFonts w:ascii="Apple Color Emoji" w:hAnsi="Apple Color Emoji" w:cs="Apple Color Emoji"/>
+        </w:rPr>
+        <w:t>⏺</w:t>
+      </w:r>
+      <w:r>
+        <w:t xml:space="preserve"> Skill is live at .</w:t>
+      </w:r>
+      <w:proofErr w:type="spellStart"/>
+      <w:r>
+        <w:t>claude</w:t>
+      </w:r>
+      <w:proofErr w:type="spellEnd"/>
+      <w:r>
+        <w:t xml:space="preserve">/commands/prop-research.md. Invoke it with /prop-research </w:t>
+      </w:r>
+      <w:proofErr w:type="spellStart"/>
+      <w:r>
+        <w:t>nfl</w:t>
+      </w:r>
+      <w:proofErr w:type="spellEnd"/>
+      <w:r>
+        <w:t xml:space="preserve"> </w:t>
+      </w:r>
+      <w:proofErr w:type="spellStart"/>
+      <w:r>
+        <w:t>rb</w:t>
+      </w:r>
+      <w:proofErr w:type="spellEnd"/>
+      <w:r>
+        <w:t xml:space="preserve"> rush-attempts (or whatever market).</w:t>
+      </w:r>
+    </w:p>
+    <w:p/>
+    <w:p>
+      <w:r>
+        <w:t xml:space="preserve">  A few things worth noting about how it's structured:                                                                             </w:t>
+      </w:r>
+    </w:p>
+    <w:p>
+      <w:r>
+        <w:t xml:space="preserve">   </w:t>
+      </w:r>
+    </w:p>
+    <w:p>
+      <w:r>
+        <w:t xml:space="preserve">  - Step 0 locks down scope (sport, seasons, books, binary vs variable line) before any work starts — this is the config that feeds</w:t>
+      </w:r>
+    </w:p>
+    <w:p>
+      <w:r>
+        <w:t xml:space="preserve">   every later decision                                                                                                          </w:t>
+      </w:r>
+    </w:p>
+    <w:p>
+      <w:r>
+        <w:t xml:space="preserve">  - Step 3 has 3 sub-steps (n=1 regression → n=1 </w:t>
+      </w:r>
+      <w:proofErr w:type="spellStart"/>
+      <w:r>
+        <w:t>XGBoost</w:t>
+      </w:r>
+      <w:proofErr w:type="spellEnd"/>
+      <w:r>
+        <w:t xml:space="preserve"> → combos) in the order you described, with the "no ROI until Step 5" rule </w:t>
+      </w:r>
+    </w:p>
+    <w:p>
+      <w:r>
+        <w:t xml:space="preserve">  explicitly enforced                                                                                                              </w:t>
+      </w:r>
+    </w:p>
+    <w:p>
+      <w:r>
+        <w:t xml:space="preserve">  - Step 7 tests are the most detailed because the E2E pipeline is where the sacks doc showed the most iteration loops —</w:t>
+      </w:r>
+    </w:p>
+    <w:p>
+      <w:r>
+        <w:t xml:space="preserve">  settlement, spine rebuild, and scoring each get their own SQL assertions                                                         </w:t>
+      </w:r>
+    </w:p>
+    <w:p>
+      <w:r>
+        <w:t xml:space="preserve">  - The </w:t>
+      </w:r>
+      <w:proofErr w:type="spellStart"/>
+      <w:r>
+        <w:t>EventBridge</w:t>
+      </w:r>
+      <w:proofErr w:type="spellEnd"/>
+      <w:r>
+        <w:t xml:space="preserve"> DISABLED rule and the 2026-09-09 date are hardcoded as defaults                                              </w:t>
+      </w:r>
+    </w:p>
+    <w:p>
+      <w:r>
+        <w:t xml:space="preserve">  - The sacks/tackles Lambda architecture is cited as the canonical reference so it knows where to look                            </w:t>
+      </w:r>
+    </w:p>
+    <w:p>
+      <w:r>
+        <w:t xml:space="preserve">                                                                                                                                   </w:t>
+      </w:r>
+    </w:p>
+    <w:p>
+      <w:r>
+        <w:t xml:space="preserve">  Want me to adjust any of the steps or test criteria?                                                                             </w:t>
+      </w:r>
+    </w:p>
+    <w:p>
+      <w:r>
+        <w:t xml:space="preserve">                                                                                                                                   </w:t>
+      </w:r>
+    </w:p>
+    <w:p>
+      <w:r>
+        <w:rPr>
+          <w:rFonts w:ascii="Segoe UI Symbol" w:hAnsi="Segoe UI Symbol" w:cs="Segoe UI Symbol"/>
+        </w:rPr>
+        <w:t>✻</w:t>
+      </w:r>
+      <w:r>
+        <w:t xml:space="preserve"> Brewed for 2m 59s </w:t>
+      </w:r>
+      <w:r>
+        <w:t xml:space="preserve">             </w:t>
+      </w:r>
+    </w:p>
+    <w:p>
+      <w:r>
         <w:lastRenderedPageBreak/>
-        <w:t xml:space="preserve">  Listed 2 directories (ctrl+o to expand)                                                                                          </w:t>
-      </w:r>
-    </w:p>
-    <w:p>
-      <w:r>
-        <w:t xml:space="preserve">                                                                                                                                   </w:t>
-      </w:r>
-    </w:p>
-    <w:p>
-      <w:r>
-        <w:rPr>
-          <w:rFonts w:ascii="Apple Color Emoji" w:hAnsi="Apple Color Emoji" w:cs="Apple Color Emoji"/>
-        </w:rPr>
-        <w:t>⏺</w:t>
-      </w:r>
-      <w:r>
-        <w:t xml:space="preserve"> The project uses .claude/commands/ (not skills/). Let me check an existing one to match the format.                 </w:t>
+        <w:t xml:space="preserve">   </w:t>
       </w:r>
     </w:p>
     <w:p/>
     <w:p>
       <w:r>
-        <w:t>…</w:t>
-      </w:r>
-    </w:p>
-    <w:p>
-      <w:r>
-        <w:rPr>
-          <w:rFonts w:ascii="Apple Color Emoji" w:hAnsi="Apple Color Emoji" w:cs="Apple Color Emoji"/>
-        </w:rPr>
-        <w:t>⏺</w:t>
-      </w:r>
-      <w:r>
-        <w:t xml:space="preserve"> Skill is live at .claude/commands/prop-research.md. Invoke it with /prop-research nfl rb rush-attempts (or whatever market).</w:t>
+        <w:t>Me running:</w:t>
       </w:r>
     </w:p>
     <w:p/>
     <w:p>
       <w:r>
-        <w:t xml:space="preserve">  A few things worth noting about how it's structured:                                                                             </w:t>
-      </w:r>
-    </w:p>
-    <w:p>
-      <w:r>
-        <w:t xml:space="preserve">   </w:t>
-      </w:r>
-    </w:p>
-    <w:p>
-      <w:r>
-        <w:t xml:space="preserve">  - Step 0 locks down scope (sport, seasons, books, binary vs variable line) before any work starts — this is the config that feeds</w:t>
-      </w:r>
-    </w:p>
-    <w:p>
-      <w:r>
-        <w:t xml:space="preserve">   every later decision                                                                                                          </w:t>
-      </w:r>
-    </w:p>
-    <w:p>
-      <w:r>
-        <w:t xml:space="preserve">  - Step 3 has 3 sub-steps (n=1 regression → n=1 XGBoost → combos) in the order you described, with the "no ROI until Step 5" rule </w:t>
-      </w:r>
-    </w:p>
-    <w:p>
-      <w:r>
-        <w:t xml:space="preserve">  explicitly enforced                                                                                                              </w:t>
-      </w:r>
-    </w:p>
-    <w:p>
-      <w:r>
-        <w:t xml:space="preserve">  - Step 7 tests are the most detailed because the E2E pipeline is where the sacks doc showed the most iteration loops —</w:t>
-      </w:r>
-    </w:p>
-    <w:p>
-      <w:r>
-        <w:t xml:space="preserve">  settlement, spine rebuild, and scoring each get their own SQL assertions                                                         </w:t>
-      </w:r>
-    </w:p>
-    <w:p>
-      <w:r>
-        <w:t xml:space="preserve">  - The EventBridge DISABLED rule and the 2026-09-09 date are hardcoded as defaults                                              </w:t>
-      </w:r>
-    </w:p>
-    <w:p>
-      <w:r>
-        <w:t xml:space="preserve">  - The sacks/tackles Lambda architecture is cited as the canonical reference so it knows where to look                            </w:t>
-      </w:r>
-    </w:p>
-    <w:p>
-      <w:r>
-        <w:t xml:space="preserve">                                                                                                                                   </w:t>
-      </w:r>
-    </w:p>
-    <w:p>
-      <w:r>
-        <w:t xml:space="preserve">  Want me to adjust any of the steps or test criteria?                                                                             </w:t>
-      </w:r>
-    </w:p>
-    <w:p>
-      <w:r>
-        <w:t xml:space="preserve">                                                                                                                                   </w:t>
-      </w:r>
-    </w:p>
-    <w:p>
-      <w:r>
-        <w:rPr>
-          <w:rFonts w:ascii="Segoe UI Symbol" w:hAnsi="Segoe UI Symbol" w:cs="Segoe UI Symbol"/>
-        </w:rPr>
-        <w:t>✻</w:t>
-      </w:r>
-      <w:r>
-        <w:t xml:space="preserve"> Brewed for 2m 59s </w:t>
-      </w:r>
-      <w:r>
-        <w:t xml:space="preserve">             </w:t>
-      </w:r>
-    </w:p>
-    <w:p>
-      <w:r>
-        <w:t xml:space="preserve">   </w:t>
+        <w:t>```</w:t>
+      </w:r>
+      <w:proofErr w:type="spellStart"/>
+      <w:r>
+        <w:t>sh</w:t>
+      </w:r>
+      <w:proofErr w:type="spellEnd"/>
+    </w:p>
+    <w:p>
+      <w:r>
+        <w:t>open /Users/thomasmyles/dev/betting/.claude/commands/prop-research.md</w:t>
+      </w:r>
+    </w:p>
+    <w:p>
+      <w:r>
+        <w:t>code</w:t>
+      </w:r>
+      <w:r>
+        <w:t xml:space="preserve"> /Users/thomasmyles/dev/betting/.claude/commands/prop-research.md</w:t>
+      </w:r>
+    </w:p>
+    <w:p>
+      <w:r>
+        <w:t>```</w:t>
       </w:r>
     </w:p>
     <w:p/>
+    <w:p>
+      <w:r>
+        <w:t>My comments;</w:t>
+      </w:r>
+      <w:r>
+        <w:t xml:space="preserve"> Had to make some changes, but it looks pretty good now</w:t>
+      </w:r>
+    </w:p>
     <w:p/>
+    <w:p>
+      <w:r>
+        <w:t xml:space="preserve">How to actually use in </w:t>
+      </w:r>
+      <w:proofErr w:type="spellStart"/>
+      <w:r>
+        <w:t>claude</w:t>
+      </w:r>
+      <w:proofErr w:type="spellEnd"/>
+      <w:r>
+        <w:t xml:space="preserve"> code:</w:t>
+      </w:r>
+    </w:p>
+    <w:p/>
+    <w:p>
+      <w:r>
+        <w:t>```</w:t>
+      </w:r>
+      <w:proofErr w:type="spellStart"/>
+      <w:r>
+        <w:t>sh</w:t>
+      </w:r>
+      <w:proofErr w:type="spellEnd"/>
+    </w:p>
+    <w:p>
+      <w:pPr>
+        <w:shd w:val="clear" w:color="auto" w:fill="121314"/>
+        <w:spacing w:after="0" w:line="270" w:lineRule="atLeast"/>
+        <w:rPr>
+          <w:rFonts w:ascii="Menlo" w:eastAsia="Times New Roman" w:hAnsi="Menlo" w:cs="Menlo"/>
+          <w:color w:val="BBBEBF"/>
+          <w:kern w:val="0"/>
+          <w:sz w:val="18"/>
+          <w:szCs w:val="18"/>
+          <w14:ligatures w14:val="none"/>
+        </w:rPr>
+      </w:pPr>
+      <w:r>
+        <w:rPr>
+          <w:rFonts w:ascii="Menlo" w:eastAsia="Times New Roman" w:hAnsi="Menlo" w:cs="Menlo"/>
+          <w:color w:val="DCDCAA"/>
+          <w:kern w:val="0"/>
+          <w:sz w:val="18"/>
+          <w:szCs w:val="18"/>
+          <w14:ligatures w14:val="none"/>
+        </w:rPr>
+        <w:t>cd</w:t>
+      </w:r>
+      <w:r>
+        <w:rPr>
+          <w:rFonts w:ascii="Menlo" w:eastAsia="Times New Roman" w:hAnsi="Menlo" w:cs="Menlo"/>
+          <w:color w:val="D4D4D4"/>
+          <w:kern w:val="0"/>
+          <w:sz w:val="18"/>
+          <w:szCs w:val="18"/>
+          <w14:ligatures w14:val="none"/>
+        </w:rPr>
+        <w:t xml:space="preserve"> </w:t>
+      </w:r>
+      <w:r>
+        <w:rPr>
+          <w:rFonts w:ascii="Menlo" w:eastAsia="Times New Roman" w:hAnsi="Menlo" w:cs="Menlo"/>
+          <w:color w:val="A5D6FF"/>
+          <w:kern w:val="0"/>
+          <w:sz w:val="18"/>
+          <w:szCs w:val="18"/>
+          <w14:ligatures w14:val="none"/>
+        </w:rPr>
+        <w:t>~/dev/betting</w:t>
+      </w:r>
+    </w:p>
+    <w:p>
+      <w:pPr>
+        <w:shd w:val="clear" w:color="auto" w:fill="121314"/>
+        <w:spacing w:after="0" w:line="270" w:lineRule="atLeast"/>
+        <w:rPr>
+          <w:rFonts w:ascii="Menlo" w:eastAsia="Times New Roman" w:hAnsi="Menlo" w:cs="Menlo"/>
+          <w:color w:val="BBBEBF"/>
+          <w:kern w:val="0"/>
+          <w:sz w:val="18"/>
+          <w:szCs w:val="18"/>
+          <w14:ligatures w14:val="none"/>
+        </w:rPr>
+      </w:pPr>
+    </w:p>
+    <w:p>
+      <w:pPr>
+        <w:shd w:val="clear" w:color="auto" w:fill="121314"/>
+        <w:spacing w:after="0" w:line="270" w:lineRule="atLeast"/>
+        <w:rPr>
+          <w:rFonts w:ascii="Menlo" w:eastAsia="Times New Roman" w:hAnsi="Menlo" w:cs="Menlo"/>
+          <w:color w:val="BBBEBF"/>
+          <w:kern w:val="0"/>
+          <w:sz w:val="18"/>
+          <w:szCs w:val="18"/>
+          <w14:ligatures w14:val="none"/>
+        </w:rPr>
+      </w:pPr>
+      <w:proofErr w:type="spellStart"/>
+      <w:r>
+        <w:rPr>
+          <w:rFonts w:ascii="Menlo" w:eastAsia="Times New Roman" w:hAnsi="Menlo" w:cs="Menlo"/>
+          <w:color w:val="FFA657"/>
+          <w:kern w:val="0"/>
+          <w:sz w:val="18"/>
+          <w:szCs w:val="18"/>
+          <w14:ligatures w14:val="none"/>
+        </w:rPr>
+        <w:t>claude</w:t>
+      </w:r>
+      <w:proofErr w:type="spellEnd"/>
+      <w:r>
+        <w:rPr>
+          <w:rFonts w:ascii="Menlo" w:eastAsia="Times New Roman" w:hAnsi="Menlo" w:cs="Menlo"/>
+          <w:color w:val="D4D4D4"/>
+          <w:kern w:val="0"/>
+          <w:sz w:val="18"/>
+          <w:szCs w:val="18"/>
+          <w14:ligatures w14:val="none"/>
+        </w:rPr>
+        <w:t xml:space="preserve"> </w:t>
+      </w:r>
+      <w:r>
+        <w:rPr>
+          <w:rFonts w:ascii="Menlo" w:eastAsia="Times New Roman" w:hAnsi="Menlo" w:cs="Menlo"/>
+          <w:color w:val="569CD6"/>
+          <w:kern w:val="0"/>
+          <w:sz w:val="18"/>
+          <w:szCs w:val="18"/>
+          <w14:ligatures w14:val="none"/>
+        </w:rPr>
+        <w:t>--dangerously-skip-permissions</w:t>
+      </w:r>
+    </w:p>
+    <w:p>
+      <w:pPr>
+        <w:shd w:val="clear" w:color="auto" w:fill="121314"/>
+        <w:spacing w:after="0" w:line="270" w:lineRule="atLeast"/>
+        <w:rPr>
+          <w:rFonts w:ascii="Menlo" w:eastAsia="Times New Roman" w:hAnsi="Menlo" w:cs="Menlo"/>
+          <w:color w:val="BBBEBF"/>
+          <w:kern w:val="0"/>
+          <w:sz w:val="18"/>
+          <w:szCs w:val="18"/>
+          <w14:ligatures w14:val="none"/>
+        </w:rPr>
+      </w:pPr>
+    </w:p>
+    <w:p>
+      <w:pPr>
+        <w:shd w:val="clear" w:color="auto" w:fill="121314"/>
+        <w:spacing w:after="0" w:line="270" w:lineRule="atLeast"/>
+        <w:rPr>
+          <w:rFonts w:ascii="Menlo" w:eastAsia="Times New Roman" w:hAnsi="Menlo" w:cs="Menlo"/>
+          <w:color w:val="BBBEBF"/>
+          <w:kern w:val="0"/>
+          <w:sz w:val="18"/>
+          <w:szCs w:val="18"/>
+          <w14:ligatures w14:val="none"/>
+        </w:rPr>
+      </w:pPr>
+      <w:r>
+        <w:rPr>
+          <w:rFonts w:ascii="Menlo" w:eastAsia="Times New Roman" w:hAnsi="Menlo" w:cs="Menlo"/>
+          <w:color w:val="FFA657"/>
+          <w:kern w:val="0"/>
+          <w:sz w:val="18"/>
+          <w:szCs w:val="18"/>
+          <w14:ligatures w14:val="none"/>
+        </w:rPr>
+        <w:t>/prop-research</w:t>
+      </w:r>
+      <w:r>
+        <w:rPr>
+          <w:rFonts w:ascii="Menlo" w:eastAsia="Times New Roman" w:hAnsi="Menlo" w:cs="Menlo"/>
+          <w:color w:val="D4D4D4"/>
+          <w:kern w:val="0"/>
+          <w:sz w:val="18"/>
+          <w:szCs w:val="18"/>
+          <w14:ligatures w14:val="none"/>
+        </w:rPr>
+        <w:t xml:space="preserve"> </w:t>
+      </w:r>
+      <w:proofErr w:type="spellStart"/>
+      <w:r>
+        <w:rPr>
+          <w:rFonts w:ascii="Menlo" w:eastAsia="Times New Roman" w:hAnsi="Menlo" w:cs="Menlo"/>
+          <w:color w:val="A5D6FF"/>
+          <w:kern w:val="0"/>
+          <w:sz w:val="18"/>
+          <w:szCs w:val="18"/>
+          <w14:ligatures w14:val="none"/>
+        </w:rPr>
+        <w:t>nfl</w:t>
+      </w:r>
+      <w:proofErr w:type="spellEnd"/>
+      <w:r>
+        <w:rPr>
+          <w:rFonts w:ascii="Menlo" w:eastAsia="Times New Roman" w:hAnsi="Menlo" w:cs="Menlo"/>
+          <w:color w:val="D4D4D4"/>
+          <w:kern w:val="0"/>
+          <w:sz w:val="18"/>
+          <w:szCs w:val="18"/>
+          <w14:ligatures w14:val="none"/>
+        </w:rPr>
+        <w:t xml:space="preserve"> </w:t>
+      </w:r>
+      <w:proofErr w:type="spellStart"/>
+      <w:r>
+        <w:rPr>
+          <w:rFonts w:ascii="Menlo" w:eastAsia="Times New Roman" w:hAnsi="Menlo" w:cs="Menlo"/>
+          <w:color w:val="A5D6FF"/>
+          <w:kern w:val="0"/>
+          <w:sz w:val="18"/>
+          <w:szCs w:val="18"/>
+          <w14:ligatures w14:val="none"/>
+        </w:rPr>
+        <w:t>rb</w:t>
+      </w:r>
+      <w:proofErr w:type="spellEnd"/>
+      <w:r>
+        <w:rPr>
+          <w:rFonts w:ascii="Menlo" w:eastAsia="Times New Roman" w:hAnsi="Menlo" w:cs="Menlo"/>
+          <w:color w:val="D4D4D4"/>
+          <w:kern w:val="0"/>
+          <w:sz w:val="18"/>
+          <w:szCs w:val="18"/>
+          <w14:ligatures w14:val="none"/>
+        </w:rPr>
+        <w:t xml:space="preserve"> </w:t>
+      </w:r>
+      <w:r>
+        <w:rPr>
+          <w:rFonts w:ascii="Menlo" w:eastAsia="Times New Roman" w:hAnsi="Menlo" w:cs="Menlo"/>
+          <w:color w:val="A5D6FF"/>
+          <w:kern w:val="0"/>
+          <w:sz w:val="18"/>
+          <w:szCs w:val="18"/>
+          <w14:ligatures w14:val="none"/>
+        </w:rPr>
+        <w:t>rush-attempts</w:t>
+      </w:r>
+    </w:p>
+    <w:p/>
+    <w:p>
+      <w:r>
+        <w:t>``</w:t>
+      </w:r>
+    </w:p>
+    <w:p>
+      <w:pPr>
+        <w:pStyle w:val="ListParagraph"/>
+        <w:numPr>
+          <w:ilvl w:val="0"/>
+          <w:numId w:val="1"/>
+        </w:numPr>
+      </w:pPr>
+    </w:p>
     <w:sectPr>
       <w:pgSz w:w="12240" w:h="15840"/>
       <w:pgMar w:top="1440" w:right="1440" w:bottom="1440" w:left="1440" w:header="720" w:footer="720" w:gutter="0"/>
@@ -866,6 +1382,127 @@
     </w:sectPr>
   </w:body>
 </w:document>
+</file>
+
+<file path=word/numbering.xml><?xml version="1.0" encoding="utf-8"?>
+<w:numbering xmlns:wpc="http://schemas.microsoft.com/office/word/2010/wordprocessingCanvas" xmlns:cx="http://schemas.microsoft.com/office/drawing/2014/chartex" xmlns:cx1="http://schemas.microsoft.com/office/drawing/2015/9/8/chartex" xmlns:cx2="http://schemas.microsoft.com/office/drawing/2015/10/21/chartex" xmlns:cx3="http://schemas.microsoft.com/office/drawing/2016/5/9/chartex" xmlns:cx4="http://schemas.microsoft.com/office/drawing/2016/5/10/chartex" xmlns:cx5="http://schemas.microsoft.com/office/drawing/2016/5/11/chartex" xmlns:cx6="http://schemas.microsoft.com/office/drawing/2016/5/12/chartex" xmlns:cx7="http://schemas.microsoft.com/office/drawing/2016/5/13/chartex" xmlns:cx8="http://schemas.microsoft.com/office/drawing/2016/5/14/chartex" xmlns:mc="http://schemas.openxmlformats.org/markup-compatibility/2006" xmlns:aink="http://schemas.microsoft.com/office/drawing/2016/ink" xmlns:am3d="http://schemas.microsoft.com/office/drawing/2017/model3d" xmlns:o="urn:schemas-microsoft-com:office:office" xmlns:oel="http://schemas.microsoft.com/office/2019/extlst" xmlns:r="http://schemas.openxmlformats.org/officeDocument/2006/relationships" xmlns:m="http://schemas.openxmlformats.org/officeDocument/2006/math" xmlns:v="urn:schemas-microsoft-com:vml" xmlns:wp14="http://schemas.microsoft.com/office/word/2010/wordprocessingDrawing" xmlns:wp="http://schemas.openxmlformats.org/drawingml/2006/wordprocessingDrawing" xmlns:w10="urn:schemas-microsoft-com:office:word" xmlns:w="http://schemas.openxmlformats.org/wordprocessingml/2006/main" xmlns:w14="http://schemas.microsoft.com/office/word/2010/wordml" xmlns:w15="http://schemas.microsoft.com/office/word/2012/wordml" xmlns:w16cex="http://schemas.microsoft.com/office/word/2018/wordml/cex" xmlns:w16cid="http://schemas.microsoft.com/office/word/2016/wordml/cid" xmlns:w16="http://schemas.microsoft.com/office/word/2018/wordml" xmlns:w16du="http://schemas.microsoft.com/office/word/2023/wordml/word16du" xmlns:w16sdtdh="http://schemas.microsoft.com/office/word/2020/wordml/sdtdatahash" xmlns:w16sdtfl="http://schemas.microsoft.com/office/word/2024/wordml/sdtformatlock" xmlns:w16se="http://schemas.microsoft.com/office/word/2015/wordml/symex" xmlns:wpg="http://schemas.microsoft.com/office/word/2010/wordprocessingGroup" xmlns:wpi="http://schemas.microsoft.com/office/word/2010/wordprocessingInk" xmlns:wne="http://schemas.microsoft.com/office/word/2006/wordml" xmlns:wps="http://schemas.microsoft.com/office/word/2010/wordprocessingShape" mc:Ignorable="w14 w15 w16se w16cid w16 w16cex w16sdtdh w16sdtfl w16du wp14">
+  <w:abstractNum w:abstractNumId="0" w15:restartNumberingAfterBreak="0">
+    <w:nsid w:val="3E865F75"/>
+    <w:multiLevelType w:val="hybridMultilevel"/>
+    <w:tmpl w:val="0D3E44FC"/>
+    <w:lvl w:ilvl="0" w:tplc="43EC44C8">
+      <w:start w:val="3"/>
+      <w:numFmt w:val="bullet"/>
+      <w:lvlText w:val="-"/>
+      <w:lvlJc w:val="left"/>
+      <w:pPr>
+        <w:ind w:left="720" w:hanging="360"/>
+      </w:pPr>
+      <w:rPr>
+        <w:rFonts w:ascii="Aptos" w:eastAsiaTheme="minorHAnsi" w:hAnsi="Aptos" w:cstheme="minorBidi" w:hint="default"/>
+      </w:rPr>
+    </w:lvl>
+    <w:lvl w:ilvl="1" w:tplc="04090003" w:tentative="1">
+      <w:start w:val="1"/>
+      <w:numFmt w:val="bullet"/>
+      <w:lvlText w:val="o"/>
+      <w:lvlJc w:val="left"/>
+      <w:pPr>
+        <w:ind w:left="1440" w:hanging="360"/>
+      </w:pPr>
+      <w:rPr>
+        <w:rFonts w:ascii="Courier New" w:hAnsi="Courier New" w:cs="Courier New" w:hint="default"/>
+      </w:rPr>
+    </w:lvl>
+    <w:lvl w:ilvl="2" w:tplc="04090005" w:tentative="1">
+      <w:start w:val="1"/>
+      <w:numFmt w:val="bullet"/>
+      <w:lvlText w:val=""/>
+      <w:lvlJc w:val="left"/>
+      <w:pPr>
+        <w:ind w:left="2160" w:hanging="360"/>
+      </w:pPr>
+      <w:rPr>
+        <w:rFonts w:ascii="Wingdings" w:hAnsi="Wingdings" w:hint="default"/>
+      </w:rPr>
+    </w:lvl>
+    <w:lvl w:ilvl="3" w:tplc="04090001" w:tentative="1">
+      <w:start w:val="1"/>
+      <w:numFmt w:val="bullet"/>
+      <w:lvlText w:val=""/>
+      <w:lvlJc w:val="left"/>
+      <w:pPr>
+        <w:ind w:left="2880" w:hanging="360"/>
+      </w:pPr>
+      <w:rPr>
+        <w:rFonts w:ascii="Symbol" w:hAnsi="Symbol" w:hint="default"/>
+      </w:rPr>
+    </w:lvl>
+    <w:lvl w:ilvl="4" w:tplc="04090003" w:tentative="1">
+      <w:start w:val="1"/>
+      <w:numFmt w:val="bullet"/>
+      <w:lvlText w:val="o"/>
+      <w:lvlJc w:val="left"/>
+      <w:pPr>
+        <w:ind w:left="3600" w:hanging="360"/>
+      </w:pPr>
+      <w:rPr>
+        <w:rFonts w:ascii="Courier New" w:hAnsi="Courier New" w:cs="Courier New" w:hint="default"/>
+      </w:rPr>
+    </w:lvl>
+    <w:lvl w:ilvl="5" w:tplc="04090005" w:tentative="1">
+      <w:start w:val="1"/>
+      <w:numFmt w:val="bullet"/>
+      <w:lvlText w:val=""/>
+      <w:lvlJc w:val="left"/>
+      <w:pPr>
+        <w:ind w:left="4320" w:hanging="360"/>
+      </w:pPr>
+      <w:rPr>
+        <w:rFonts w:ascii="Wingdings" w:hAnsi="Wingdings" w:hint="default"/>
+      </w:rPr>
+    </w:lvl>
+    <w:lvl w:ilvl="6" w:tplc="04090001" w:tentative="1">
+      <w:start w:val="1"/>
+      <w:numFmt w:val="bullet"/>
+      <w:lvlText w:val=""/>
+      <w:lvlJc w:val="left"/>
+      <w:pPr>
+        <w:ind w:left="5040" w:hanging="360"/>
+      </w:pPr>
+      <w:rPr>
+        <w:rFonts w:ascii="Symbol" w:hAnsi="Symbol" w:hint="default"/>
+      </w:rPr>
+    </w:lvl>
+    <w:lvl w:ilvl="7" w:tplc="04090003" w:tentative="1">
+      <w:start w:val="1"/>
+      <w:numFmt w:val="bullet"/>
+      <w:lvlText w:val="o"/>
+      <w:lvlJc w:val="left"/>
+      <w:pPr>
+        <w:ind w:left="5760" w:hanging="360"/>
+      </w:pPr>
+      <w:rPr>
+        <w:rFonts w:ascii="Courier New" w:hAnsi="Courier New" w:cs="Courier New" w:hint="default"/>
+      </w:rPr>
+    </w:lvl>
+    <w:lvl w:ilvl="8" w:tplc="04090005" w:tentative="1">
+      <w:start w:val="1"/>
+      <w:numFmt w:val="bullet"/>
+      <w:lvlText w:val=""/>
+      <w:lvlJc w:val="left"/>
+      <w:pPr>
+        <w:ind w:left="6480" w:hanging="360"/>
+      </w:pPr>
+      <w:rPr>
+        <w:rFonts w:ascii="Wingdings" w:hAnsi="Wingdings" w:hint="default"/>
+      </w:rPr>
+    </w:lvl>
+  </w:abstractNum>
+  <w:num w:numId="1" w16cid:durableId="162282807">
+    <w:abstractNumId w:val="0"/>
+  </w:num>
+</w:numbering>
 </file>
 
 <file path=word/styles.xml><?xml version="1.0" encoding="utf-8"?>

</xml_diff>